<commit_message>
Update W3C validation section in report; include detailed validation results and screenshots for HTML and CSS files
</commit_message>
<xml_diff>
--- a/HS1021_Report_PeppyPuffinCafe.docx
+++ b/HS1021_Report_PeppyPuffinCafe.docx
@@ -1829,31 +1829,296 @@
           <w:b w:val="0"/>
           <w:i w:val="0"/>
         </w:rPr>
-        <w:t>All four HTML pages were validated at validator.w3.org and the stylesheet was validated at jigsaw.w3.org/css-validator. Screenshots of the final validation results showing no critical errors are included below.</w:t>
+        <w:t>All four HTML pages and the stylesheet were validated using the W3C validation services. Screenshots of the final results are shown below — no critical errors are present in any file.</w:t>
       </w:r>
     </w:p>
     <w:p>
       <w:pPr>
-        <w:spacing w:before="0" w:after="120"/>
+        <w:spacing w:before="120" w:after="40"/>
+      </w:pPr>
+      <w:r>
+        <w:rPr>
+          <w:b/>
+          <w:i w:val="0"/>
+        </w:rPr>
+        <w:t>HTML Validation Results</w:t>
+      </w:r>
+    </w:p>
+    <w:p>
+      <w:pPr>
+        <w:spacing w:before="120" w:after="40"/>
       </w:pPr>
       <w:r>
         <w:rPr>
           <w:b w:val="0"/>
           <w:i/>
+          <w:sz w:val="18"/>
         </w:rPr>
-        <w:t>[Insert W3C HTML validator screenshots here - one per page]</w:t>
+        <w:t>Figure 1 — index.html validation result</w:t>
       </w:r>
     </w:p>
     <w:p>
       <w:pPr>
-        <w:spacing w:before="0" w:after="120"/>
+        <w:spacing w:after="200"/>
+        <w:jc w:val="center"/>
+      </w:pPr>
+      <w:r>
+        <w:drawing>
+          <wp:inline xmlns:a="http://schemas.openxmlformats.org/drawingml/2006/main" xmlns:pic="http://schemas.openxmlformats.org/drawingml/2006/picture">
+            <wp:extent cx="5486400" cy="1508372"/>
+            <wp:docPr id="1" name="Picture 1"/>
+            <wp:cNvGraphicFramePr>
+              <a:graphicFrameLocks noChangeAspect="1"/>
+            </wp:cNvGraphicFramePr>
+            <a:graphic>
+              <a:graphicData uri="http://schemas.openxmlformats.org/drawingml/2006/picture">
+                <pic:pic>
+                  <pic:nvPicPr>
+                    <pic:cNvPr id="0" name="index-html-w3c-validation.png"/>
+                    <pic:cNvPicPr/>
+                  </pic:nvPicPr>
+                  <pic:blipFill>
+                    <a:blip r:embed="rId9"/>
+                    <a:stretch>
+                      <a:fillRect/>
+                    </a:stretch>
+                  </pic:blipFill>
+                  <pic:spPr>
+                    <a:xfrm>
+                      <a:off x="0" y="0"/>
+                      <a:ext cx="5486400" cy="1508372"/>
+                    </a:xfrm>
+                    <a:prstGeom prst="rect"/>
+                  </pic:spPr>
+                </pic:pic>
+              </a:graphicData>
+            </a:graphic>
+          </wp:inline>
+        </w:drawing>
+      </w:r>
+    </w:p>
+    <w:p>
+      <w:pPr>
+        <w:spacing w:before="120" w:after="40"/>
       </w:pPr>
       <w:r>
         <w:rPr>
           <w:b w:val="0"/>
           <w:i/>
+          <w:sz w:val="18"/>
         </w:rPr>
-        <w:t>[Insert W3C CSS validator screenshot here]</w:t>
+        <w:t>Figure 2 — menu.html validation result</w:t>
+      </w:r>
+    </w:p>
+    <w:p>
+      <w:pPr>
+        <w:spacing w:after="200"/>
+        <w:jc w:val="center"/>
+      </w:pPr>
+      <w:r>
+        <w:drawing>
+          <wp:inline xmlns:a="http://schemas.openxmlformats.org/drawingml/2006/main" xmlns:pic="http://schemas.openxmlformats.org/drawingml/2006/picture">
+            <wp:extent cx="5486400" cy="1469254"/>
+            <wp:docPr id="2" name="Picture 2"/>
+            <wp:cNvGraphicFramePr>
+              <a:graphicFrameLocks noChangeAspect="1"/>
+            </wp:cNvGraphicFramePr>
+            <a:graphic>
+              <a:graphicData uri="http://schemas.openxmlformats.org/drawingml/2006/picture">
+                <pic:pic>
+                  <pic:nvPicPr>
+                    <pic:cNvPr id="0" name="menu-html-w3c-validation.png"/>
+                    <pic:cNvPicPr/>
+                  </pic:nvPicPr>
+                  <pic:blipFill>
+                    <a:blip r:embed="rId10"/>
+                    <a:stretch>
+                      <a:fillRect/>
+                    </a:stretch>
+                  </pic:blipFill>
+                  <pic:spPr>
+                    <a:xfrm>
+                      <a:off x="0" y="0"/>
+                      <a:ext cx="5486400" cy="1469254"/>
+                    </a:xfrm>
+                    <a:prstGeom prst="rect"/>
+                  </pic:spPr>
+                </pic:pic>
+              </a:graphicData>
+            </a:graphic>
+          </wp:inline>
+        </w:drawing>
+      </w:r>
+    </w:p>
+    <w:p>
+      <w:pPr>
+        <w:spacing w:before="120" w:after="40"/>
+      </w:pPr>
+      <w:r>
+        <w:rPr>
+          <w:b w:val="0"/>
+          <w:i/>
+          <w:sz w:val="18"/>
+        </w:rPr>
+        <w:t>Figure 3 — gallery.html validation result</w:t>
+      </w:r>
+    </w:p>
+    <w:p>
+      <w:pPr>
+        <w:spacing w:after="200"/>
+        <w:jc w:val="center"/>
+      </w:pPr>
+      <w:r>
+        <w:drawing>
+          <wp:inline xmlns:a="http://schemas.openxmlformats.org/drawingml/2006/main" xmlns:pic="http://schemas.openxmlformats.org/drawingml/2006/picture">
+            <wp:extent cx="5486400" cy="1437601"/>
+            <wp:docPr id="3" name="Picture 3"/>
+            <wp:cNvGraphicFramePr>
+              <a:graphicFrameLocks noChangeAspect="1"/>
+            </wp:cNvGraphicFramePr>
+            <a:graphic>
+              <a:graphicData uri="http://schemas.openxmlformats.org/drawingml/2006/picture">
+                <pic:pic>
+                  <pic:nvPicPr>
+                    <pic:cNvPr id="0" name="gallery-html-w3c-validation.png"/>
+                    <pic:cNvPicPr/>
+                  </pic:nvPicPr>
+                  <pic:blipFill>
+                    <a:blip r:embed="rId11"/>
+                    <a:stretch>
+                      <a:fillRect/>
+                    </a:stretch>
+                  </pic:blipFill>
+                  <pic:spPr>
+                    <a:xfrm>
+                      <a:off x="0" y="0"/>
+                      <a:ext cx="5486400" cy="1437601"/>
+                    </a:xfrm>
+                    <a:prstGeom prst="rect"/>
+                  </pic:spPr>
+                </pic:pic>
+              </a:graphicData>
+            </a:graphic>
+          </wp:inline>
+        </w:drawing>
+      </w:r>
+    </w:p>
+    <w:p>
+      <w:pPr>
+        <w:spacing w:before="120" w:after="40"/>
+      </w:pPr>
+      <w:r>
+        <w:rPr>
+          <w:b w:val="0"/>
+          <w:i/>
+          <w:sz w:val="18"/>
+        </w:rPr>
+        <w:t>Figure 4 — contact.html validation result</w:t>
+      </w:r>
+    </w:p>
+    <w:p>
+      <w:pPr>
+        <w:spacing w:after="200"/>
+        <w:jc w:val="center"/>
+      </w:pPr>
+      <w:r>
+        <w:drawing>
+          <wp:inline xmlns:a="http://schemas.openxmlformats.org/drawingml/2006/main" xmlns:pic="http://schemas.openxmlformats.org/drawingml/2006/picture">
+            <wp:extent cx="5486400" cy="1282099"/>
+            <wp:docPr id="4" name="Picture 4"/>
+            <wp:cNvGraphicFramePr>
+              <a:graphicFrameLocks noChangeAspect="1"/>
+            </wp:cNvGraphicFramePr>
+            <a:graphic>
+              <a:graphicData uri="http://schemas.openxmlformats.org/drawingml/2006/picture">
+                <pic:pic>
+                  <pic:nvPicPr>
+                    <pic:cNvPr id="0" name="contact-html-w3c-validation.png"/>
+                    <pic:cNvPicPr/>
+                  </pic:nvPicPr>
+                  <pic:blipFill>
+                    <a:blip r:embed="rId12"/>
+                    <a:stretch>
+                      <a:fillRect/>
+                    </a:stretch>
+                  </pic:blipFill>
+                  <pic:spPr>
+                    <a:xfrm>
+                      <a:off x="0" y="0"/>
+                      <a:ext cx="5486400" cy="1282099"/>
+                    </a:xfrm>
+                    <a:prstGeom prst="rect"/>
+                  </pic:spPr>
+                </pic:pic>
+              </a:graphicData>
+            </a:graphic>
+          </wp:inline>
+        </w:drawing>
+      </w:r>
+    </w:p>
+    <w:p>
+      <w:pPr>
+        <w:spacing w:before="120" w:after="40"/>
+      </w:pPr>
+      <w:r>
+        <w:rPr>
+          <w:b/>
+          <w:i w:val="0"/>
+        </w:rPr>
+        <w:t>CSS Validation Result</w:t>
+      </w:r>
+    </w:p>
+    <w:p>
+      <w:pPr>
+        <w:spacing w:before="120" w:after="40"/>
+      </w:pPr>
+      <w:r>
+        <w:rPr>
+          <w:b w:val="0"/>
+          <w:i/>
+          <w:sz w:val="18"/>
+        </w:rPr>
+        <w:t>Figure 5 — styles.css validation result</w:t>
+      </w:r>
+    </w:p>
+    <w:p>
+      <w:pPr>
+        <w:spacing w:after="200"/>
+        <w:jc w:val="center"/>
+      </w:pPr>
+      <w:r>
+        <w:drawing>
+          <wp:inline xmlns:a="http://schemas.openxmlformats.org/drawingml/2006/main" xmlns:pic="http://schemas.openxmlformats.org/drawingml/2006/picture">
+            <wp:extent cx="5486400" cy="933809"/>
+            <wp:docPr id="5" name="Picture 5"/>
+            <wp:cNvGraphicFramePr>
+              <a:graphicFrameLocks noChangeAspect="1"/>
+            </wp:cNvGraphicFramePr>
+            <a:graphic>
+              <a:graphicData uri="http://schemas.openxmlformats.org/drawingml/2006/picture">
+                <pic:pic>
+                  <pic:nvPicPr>
+                    <pic:cNvPr id="0" name="styles-css-w3c-validation.png"/>
+                    <pic:cNvPicPr/>
+                  </pic:nvPicPr>
+                  <pic:blipFill>
+                    <a:blip r:embed="rId13"/>
+                    <a:stretch>
+                      <a:fillRect/>
+                    </a:stretch>
+                  </pic:blipFill>
+                  <pic:spPr>
+                    <a:xfrm>
+                      <a:off x="0" y="0"/>
+                      <a:ext cx="5486400" cy="933809"/>
+                    </a:xfrm>
+                    <a:prstGeom prst="rect"/>
+                  </pic:spPr>
+                </pic:pic>
+              </a:graphicData>
+            </a:graphic>
+          </wp:inline>
+        </w:drawing>
       </w:r>
     </w:p>
     <w:p>

</xml_diff>